<commit_message>
Sync brand files from _brand/
</commit_message>
<xml_diff>
--- a/_extensions/ppadem-word/ppadem-reference.docx
+++ b/_extensions/ppadem-word/ppadem-reference.docx
@@ -7,9 +7,7 @@
         <w:pStyle w:val="Title"/>
       </w:pPr>
       <w:r>
-        <w:t xml:space="preserve">
-Title
-</w:t>
+        <w:t xml:space="preserve">Title</w:t>
       </w:r>
     </w:p>
     <w:p>
@@ -17,9 +15,7 @@
         <w:pStyle w:val="Subtitle"/>
       </w:pPr>
       <w:r>
-        <w:t xml:space="preserve">
-Subtitle
-</w:t>
+        <w:t xml:space="preserve">Subtitle</w:t>
       </w:r>
     </w:p>
     <w:p>
@@ -27,9 +23,7 @@
         <w:pStyle w:val="Author"/>
       </w:pPr>
       <w:r>
-        <w:t xml:space="preserve">
-Author
-</w:t>
+        <w:t xml:space="preserve">Author</w:t>
       </w:r>
     </w:p>
     <w:p>
@@ -37,9 +31,7 @@
         <w:pStyle w:val="Date"/>
       </w:pPr>
       <w:r>
-        <w:t xml:space="preserve">
-Date
-</w:t>
+        <w:t xml:space="preserve">Date</w:t>
       </w:r>
     </w:p>
     <w:p>
@@ -47,9 +39,7 @@
         <w:pStyle w:val="Abstract"/>
       </w:pPr>
       <w:r>
-        <w:t xml:space="preserve">
-Abstract
-</w:t>
+        <w:t xml:space="preserve">Abstract</w:t>
       </w:r>
     </w:p>
     <w:p>
@@ -58,9 +48,7 @@
       </w:pPr>
       <w:bookmarkStart w:id="21" w:name="heading-1"/>
       <w:r>
-        <w:t xml:space="preserve">
-Heading 1
-</w:t>
+        <w:t xml:space="preserve">Heading 1</w:t>
       </w:r>
       <w:bookmarkEnd w:id="21"/>
     </w:p>
@@ -70,9 +58,7 @@
       </w:pPr>
       <w:bookmarkStart w:id="22" w:name="heading-2"/>
       <w:r>
-        <w:t xml:space="preserve">
-Heading 2
-</w:t>
+        <w:t xml:space="preserve">Heading 2</w:t>
       </w:r>
       <w:bookmarkEnd w:id="22"/>
     </w:p>
@@ -82,9 +68,7 @@
       </w:pPr>
       <w:bookmarkStart w:id="23" w:name="heading-3"/>
       <w:r>
-        <w:t xml:space="preserve">
-Heading 3
-</w:t>
+        <w:t xml:space="preserve">Heading 3</w:t>
       </w:r>
       <w:bookmarkEnd w:id="23"/>
     </w:p>
@@ -94,9 +78,7 @@
       </w:pPr>
       <w:bookmarkStart w:id="24" w:name="heading-4"/>
       <w:r>
-        <w:t xml:space="preserve">
-Heading 4
-</w:t>
+        <w:t xml:space="preserve">Heading 4</w:t>
       </w:r>
       <w:bookmarkEnd w:id="24"/>
     </w:p>
@@ -106,9 +88,7 @@
       </w:pPr>
       <w:bookmarkStart w:id="25" w:name="heading-5"/>
       <w:r>
-        <w:t xml:space="preserve">
-Heading 5
-</w:t>
+        <w:t xml:space="preserve">Heading 5</w:t>
       </w:r>
       <w:bookmarkEnd w:id="25"/>
     </w:p>
@@ -118,9 +98,7 @@
       </w:pPr>
       <w:bookmarkStart w:id="26" w:name="heading-6"/>
       <w:r>
-        <w:t xml:space="preserve">
-Heading 6
-</w:t>
+        <w:t xml:space="preserve">Heading 6</w:t>
       </w:r>
       <w:bookmarkEnd w:id="26"/>
     </w:p>
@@ -130,9 +108,7 @@
       </w:pPr>
       <w:bookmarkStart w:id="27" w:name="heading-7"/>
       <w:r>
-        <w:t xml:space="preserve">
-Heading 7
-</w:t>
+        <w:t xml:space="preserve">Heading 7</w:t>
       </w:r>
       <w:bookmarkEnd w:id="27"/>
     </w:p>
@@ -142,9 +118,7 @@
       </w:pPr>
       <w:bookmarkStart w:id="28" w:name="heading-8"/>
       <w:r>
-        <w:t xml:space="preserve">
-Heading 8
-</w:t>
+        <w:t xml:space="preserve">Heading 8</w:t>
       </w:r>
       <w:bookmarkEnd w:id="28"/>
     </w:p>
@@ -154,9 +128,7 @@
       </w:pPr>
       <w:bookmarkStart w:id="29" w:name="heading-9"/>
       <w:r>
-        <w:t xml:space="preserve">
-Heading 9
-</w:t>
+        <w:t xml:space="preserve">Heading 9</w:t>
       </w:r>
       <w:bookmarkEnd w:id="29"/>
     </w:p>
@@ -165,9 +137,7 @@
         <w:pStyle w:val="FirstParagraph"/>
       </w:pPr>
       <w:r>
-        <w:t xml:space="preserve">
-First Paragraph.
-</w:t>
+        <w:t xml:space="preserve">First Paragraph.</w:t>
       </w:r>
     </w:p>
     <w:p>
@@ -175,54 +145,39 @@
         <w:pStyle w:val="BodyText"/>
       </w:pPr>
       <w:r>
-        <w:t xml:space="preserve">
-Body Text. Body Text Char.
-</w:t>
-      </w:r>
-      <w:r>
-        <w:t xml:space="preserve">
-</w:t>
+        <w:t xml:space="preserve">Body Text. Body Text Char.</w:t>
+      </w:r>
+      <w:r>
+        <w:t xml:space="preserve"> </w:t>
       </w:r>
       <w:r>
         <w:rPr>
           <w:rStyle w:val="VerbatimChar"/>
         </w:rPr>
-        <w:t xml:space="preserve">
-Verbatim Char
-</w:t>
-      </w:r>
-      <w:r>
-        <w:t xml:space="preserve">
-.
-</w:t>
-      </w:r>
-      <w:r>
-        <w:t xml:space="preserve">
-</w:t>
+        <w:t xml:space="preserve">Verbatim Char</w:t>
+      </w:r>
+      <w:r>
+        <w:t xml:space="preserve">.</w:t>
+      </w:r>
+      <w:r>
+        <w:t xml:space="preserve"> </w:t>
       </w:r>
       <w:hyperlink r:id="rId30">
         <w:r>
           <w:rPr>
             <w:rStyle w:val="Hyperlink"/>
           </w:rPr>
-          <w:t xml:space="preserve">
-Hyperlink
-</w:t>
+          <w:t xml:space="preserve">Hyperlink</w:t>
         </w:r>
       </w:hyperlink>
       <w:r>
-        <w:t xml:space="preserve">
-.
-</w:t>
-      </w:r>
-      <w:r>
-        <w:t xml:space="preserve">
-</w:t>
-      </w:r>
-      <w:r>
-        <w:t xml:space="preserve">
-Footnote.
-</w:t>
+        <w:t xml:space="preserve">.</w:t>
+      </w:r>
+      <w:r>
+        <w:t xml:space="preserve"> </w:t>
+      </w:r>
+      <w:r>
+        <w:t xml:space="preserve">Footnote.</w:t>
       </w:r>
       <w:r>
         <w:rPr>
@@ -236,9 +191,7 @@
         <w:pStyle w:val="BlockText"/>
       </w:pPr>
       <w:r>
-        <w:t xml:space="preserve">
-Block Text.
-</w:t>
+        <w:t xml:space="preserve">Block Text.</w:t>
       </w:r>
     </w:p>
     <w:p>
@@ -246,9 +199,7 @@
         <w:pStyle w:val="TableCaption"/>
       </w:pPr>
       <w:r>
-        <w:t xml:space="preserve">
-Table caption.
-</w:t>
+        <w:t xml:space="preserve">Table caption.</w:t>
       </w:r>
     </w:p>
     <w:tbl>
@@ -275,9 +226,7 @@
               <w:jc w:val="left"/>
             </w:pPr>
             <w:r>
-              <w:t xml:space="preserve">
-Table
-</w:t>
+              <w:t xml:space="preserve">Table</w:t>
             </w:r>
           </w:p>
         </w:tc>
@@ -294,9 +243,7 @@
               <w:jc w:val="left"/>
             </w:pPr>
             <w:r>
-              <w:t xml:space="preserve">
-Table
-</w:t>
+              <w:t xml:space="preserve">Table</w:t>
             </w:r>
           </w:p>
         </w:tc>
@@ -309,9 +256,7 @@
               <w:jc w:val="left"/>
             </w:pPr>
             <w:r>
-              <w:t xml:space="preserve">
-1
-</w:t>
+              <w:t xml:space="preserve">1</w:t>
             </w:r>
           </w:p>
         </w:tc>
@@ -322,9 +267,7 @@
               <w:jc w:val="left"/>
             </w:pPr>
             <w:r>
-              <w:t xml:space="preserve">
-2
-</w:t>
+              <w:t xml:space="preserve">2</w:t>
             </w:r>
           </w:p>
         </w:tc>
@@ -335,9 +278,7 @@
         <w:pStyle w:val="ImageCaption"/>
       </w:pPr>
       <w:r>
-        <w:t xml:space="preserve">
-Image Caption
-</w:t>
+        <w:t xml:space="preserve">Image Caption</w:t>
       </w:r>
     </w:p>
     <w:p>
@@ -345,9 +286,7 @@
         <w:pStyle w:val="DefinitionTerm"/>
       </w:pPr>
       <w:r>
-        <w:t xml:space="preserve">
-DefinitionTerm
-</w:t>
+        <w:t xml:space="preserve">DefinitionTerm</w:t>
       </w:r>
     </w:p>
     <w:p>
@@ -355,9 +294,7 @@
         <w:pStyle w:val="Definition"/>
       </w:pPr>
       <w:r>
-        <w:t xml:space="preserve">
-Definition
-</w:t>
+        <w:t xml:space="preserve">Definition</w:t>
       </w:r>
     </w:p>
     <w:p>
@@ -365,9 +302,7 @@
         <w:pStyle w:val="DefinitionTerm"/>
       </w:pPr>
       <w:r>
-        <w:t xml:space="preserve">
-DefinitionTerm
-</w:t>
+        <w:t xml:space="preserve">DefinitionTerm</w:t>
       </w:r>
     </w:p>
     <w:p>
@@ -375,9 +310,7 @@
         <w:pStyle w:val="Definition"/>
       </w:pPr>
       <w:r>
-        <w:t xml:space="preserve">
-Definition
-</w:t>
+        <w:t xml:space="preserve">Definition</w:t>
       </w:r>
     </w:p>
     <w:sectPr>
@@ -452,10 +385,15 @@
         <w:footnoteRef/>
       </w:r>
       <w:r>
-        <w:t xml:space="preserve"> </w:t>
-      </w:r>
-      <w:r>
-        <w:t xml:space="preserve">Footnote Text.</w:t>
+        <w:t>Footnote Text.</w:t>
+      </w:r>
+    </w:p>
+    <w:p>
+      <w:pPr>
+        <w:pStyle w:val="FootnoteBlockText"/>
+      </w:pPr>
+      <w:r>
+        <w:t>Footnote Block Text</w:t>
       </w:r>
     </w:p>
   </w:footnote>
@@ -623,10 +561,10 @@
   <w:docDefaults>
     <w:rPrDefault>
       <w:rPr>
-        <w:rFonts w:asciiTheme="minorHAnsi" w:eastAsiaTheme="minorHAnsi" w:hAnsiTheme="minorHAnsi" w:cstheme="minorBidi"/>
+        <w:rFonts w:asciiTheme="minorHAnsi" w:eastAsiaTheme="minorEastAsia" w:hAnsiTheme="minorHAnsi" w:cstheme="minorBidi"/>
         <w:sz w:val="24"/>
         <w:szCs w:val="24"/>
-        <w:lang w:val="en-US" w:eastAsia="en-US" w:bidi="ar-SA"/>
+        <w:lang w:val="en-US" w:eastAsia="zh-CN" w:bidi="ar-SA"/>
       </w:rPr>
     </w:rPrDefault>
     <w:pPrDefault>

</xml_diff>

<commit_message>
Add PowerPoint and Word templates for non-Quarto colleagues
- office-templates/: PPADEM .potx and .dotx templates plus example
  .pptx/.docx files and a plain-English README
- New ppadem-powerpoint-pptx Quarto format sharing the same slide master,
  with a powerpoint.qmd starter
- Word reference doc gains PPADEM theme colours and named styles (Key
  Findings, Executive Summary, Note/Warning/Important, Pull Quote, Label),
  usable from Quarto via custom-style
- All Office files are generated from _brand/ by tools/build-powerpoint.py
  and tools/build-reference-docx.py; sync-brand.py --office and the Sync
  brand action rebuild them reproducibly

Co-Authored-By: Claude Opus 5.5 <noreply@anthropic.com>
</commit_message>
<xml_diff>
--- a/_extensions/ppadem-word/ppadem-reference.docx
+++ b/_extensions/ppadem-word/ppadem-reference.docx
@@ -7,7 +7,9 @@
         <w:pStyle w:val="Title"/>
       </w:pPr>
       <w:r>
-        <w:t xml:space="preserve">Title</w:t>
+        <w:t xml:space="preserve">
+Title
+</w:t>
       </w:r>
     </w:p>
     <w:p>
@@ -15,7 +17,9 @@
         <w:pStyle w:val="Subtitle"/>
       </w:pPr>
       <w:r>
-        <w:t xml:space="preserve">Subtitle</w:t>
+        <w:t xml:space="preserve">
+Subtitle
+</w:t>
       </w:r>
     </w:p>
     <w:p>
@@ -23,7 +27,9 @@
         <w:pStyle w:val="Author"/>
       </w:pPr>
       <w:r>
-        <w:t xml:space="preserve">Author</w:t>
+        <w:t xml:space="preserve">
+Author
+</w:t>
       </w:r>
     </w:p>
     <w:p>
@@ -31,7 +37,9 @@
         <w:pStyle w:val="Date"/>
       </w:pPr>
       <w:r>
-        <w:t xml:space="preserve">Date</w:t>
+        <w:t xml:space="preserve">
+Date
+</w:t>
       </w:r>
     </w:p>
     <w:p>
@@ -39,7 +47,9 @@
         <w:pStyle w:val="Abstract"/>
       </w:pPr>
       <w:r>
-        <w:t xml:space="preserve">Abstract</w:t>
+        <w:t xml:space="preserve">
+Abstract
+</w:t>
       </w:r>
     </w:p>
     <w:p>
@@ -48,7 +58,9 @@
       </w:pPr>
       <w:bookmarkStart w:id="21" w:name="heading-1"/>
       <w:r>
-        <w:t xml:space="preserve">Heading 1</w:t>
+        <w:t xml:space="preserve">
+Heading 1
+</w:t>
       </w:r>
       <w:bookmarkEnd w:id="21"/>
     </w:p>
@@ -58,7 +70,9 @@
       </w:pPr>
       <w:bookmarkStart w:id="22" w:name="heading-2"/>
       <w:r>
-        <w:t xml:space="preserve">Heading 2</w:t>
+        <w:t xml:space="preserve">
+Heading 2
+</w:t>
       </w:r>
       <w:bookmarkEnd w:id="22"/>
     </w:p>
@@ -68,7 +82,9 @@
       </w:pPr>
       <w:bookmarkStart w:id="23" w:name="heading-3"/>
       <w:r>
-        <w:t xml:space="preserve">Heading 3</w:t>
+        <w:t xml:space="preserve">
+Heading 3
+</w:t>
       </w:r>
       <w:bookmarkEnd w:id="23"/>
     </w:p>
@@ -78,7 +94,9 @@
       </w:pPr>
       <w:bookmarkStart w:id="24" w:name="heading-4"/>
       <w:r>
-        <w:t xml:space="preserve">Heading 4</w:t>
+        <w:t xml:space="preserve">
+Heading 4
+</w:t>
       </w:r>
       <w:bookmarkEnd w:id="24"/>
     </w:p>
@@ -88,7 +106,9 @@
       </w:pPr>
       <w:bookmarkStart w:id="25" w:name="heading-5"/>
       <w:r>
-        <w:t xml:space="preserve">Heading 5</w:t>
+        <w:t xml:space="preserve">
+Heading 5
+</w:t>
       </w:r>
       <w:bookmarkEnd w:id="25"/>
     </w:p>
@@ -98,7 +118,9 @@
       </w:pPr>
       <w:bookmarkStart w:id="26" w:name="heading-6"/>
       <w:r>
-        <w:t xml:space="preserve">Heading 6</w:t>
+        <w:t xml:space="preserve">
+Heading 6
+</w:t>
       </w:r>
       <w:bookmarkEnd w:id="26"/>
     </w:p>
@@ -108,7 +130,9 @@
       </w:pPr>
       <w:bookmarkStart w:id="27" w:name="heading-7"/>
       <w:r>
-        <w:t xml:space="preserve">Heading 7</w:t>
+        <w:t xml:space="preserve">
+Heading 7
+</w:t>
       </w:r>
       <w:bookmarkEnd w:id="27"/>
     </w:p>
@@ -118,7 +142,9 @@
       </w:pPr>
       <w:bookmarkStart w:id="28" w:name="heading-8"/>
       <w:r>
-        <w:t xml:space="preserve">Heading 8</w:t>
+        <w:t xml:space="preserve">
+Heading 8
+</w:t>
       </w:r>
       <w:bookmarkEnd w:id="28"/>
     </w:p>
@@ -128,7 +154,9 @@
       </w:pPr>
       <w:bookmarkStart w:id="29" w:name="heading-9"/>
       <w:r>
-        <w:t xml:space="preserve">Heading 9</w:t>
+        <w:t xml:space="preserve">
+Heading 9
+</w:t>
       </w:r>
       <w:bookmarkEnd w:id="29"/>
     </w:p>
@@ -137,7 +165,9 @@
         <w:pStyle w:val="FirstParagraph"/>
       </w:pPr>
       <w:r>
-        <w:t xml:space="preserve">First Paragraph.</w:t>
+        <w:t xml:space="preserve">
+First Paragraph.
+</w:t>
       </w:r>
     </w:p>
     <w:p>
@@ -145,39 +175,54 @@
         <w:pStyle w:val="BodyText"/>
       </w:pPr>
       <w:r>
-        <w:t xml:space="preserve">Body Text. Body Text Char.</w:t>
-      </w:r>
-      <w:r>
-        <w:t xml:space="preserve"> </w:t>
+        <w:t xml:space="preserve">
+Body Text. Body Text Char.
+</w:t>
+      </w:r>
+      <w:r>
+        <w:t xml:space="preserve">
+</w:t>
       </w:r>
       <w:r>
         <w:rPr>
           <w:rStyle w:val="VerbatimChar"/>
         </w:rPr>
-        <w:t xml:space="preserve">Verbatim Char</w:t>
-      </w:r>
-      <w:r>
-        <w:t xml:space="preserve">.</w:t>
-      </w:r>
-      <w:r>
-        <w:t xml:space="preserve"> </w:t>
+        <w:t xml:space="preserve">
+Verbatim Char
+</w:t>
+      </w:r>
+      <w:r>
+        <w:t xml:space="preserve">
+.
+</w:t>
+      </w:r>
+      <w:r>
+        <w:t xml:space="preserve">
+</w:t>
       </w:r>
       <w:hyperlink r:id="rId30">
         <w:r>
           <w:rPr>
             <w:rStyle w:val="Hyperlink"/>
           </w:rPr>
-          <w:t xml:space="preserve">Hyperlink</w:t>
+          <w:t xml:space="preserve">
+Hyperlink
+</w:t>
         </w:r>
       </w:hyperlink>
       <w:r>
-        <w:t xml:space="preserve">.</w:t>
-      </w:r>
-      <w:r>
-        <w:t xml:space="preserve"> </w:t>
-      </w:r>
-      <w:r>
-        <w:t xml:space="preserve">Footnote.</w:t>
+        <w:t xml:space="preserve">
+.
+</w:t>
+      </w:r>
+      <w:r>
+        <w:t xml:space="preserve">
+</w:t>
+      </w:r>
+      <w:r>
+        <w:t xml:space="preserve">
+Footnote.
+</w:t>
       </w:r>
       <w:r>
         <w:rPr>
@@ -191,7 +236,9 @@
         <w:pStyle w:val="BlockText"/>
       </w:pPr>
       <w:r>
-        <w:t xml:space="preserve">Block Text.</w:t>
+        <w:t xml:space="preserve">
+Block Text.
+</w:t>
       </w:r>
     </w:p>
     <w:p>
@@ -199,7 +246,9 @@
         <w:pStyle w:val="TableCaption"/>
       </w:pPr>
       <w:r>
-        <w:t xml:space="preserve">Table caption.</w:t>
+        <w:t xml:space="preserve">
+Table caption.
+</w:t>
       </w:r>
     </w:p>
     <w:tbl>
@@ -226,7 +275,9 @@
               <w:jc w:val="left"/>
             </w:pPr>
             <w:r>
-              <w:t xml:space="preserve">Table</w:t>
+              <w:t xml:space="preserve">
+Table
+</w:t>
             </w:r>
           </w:p>
         </w:tc>
@@ -243,7 +294,9 @@
               <w:jc w:val="left"/>
             </w:pPr>
             <w:r>
-              <w:t xml:space="preserve">Table</w:t>
+              <w:t xml:space="preserve">
+Table
+</w:t>
             </w:r>
           </w:p>
         </w:tc>
@@ -256,7 +309,9 @@
               <w:jc w:val="left"/>
             </w:pPr>
             <w:r>
-              <w:t xml:space="preserve">1</w:t>
+              <w:t xml:space="preserve">
+1
+</w:t>
             </w:r>
           </w:p>
         </w:tc>
@@ -267,7 +322,9 @@
               <w:jc w:val="left"/>
             </w:pPr>
             <w:r>
-              <w:t xml:space="preserve">2</w:t>
+              <w:t xml:space="preserve">
+2
+</w:t>
             </w:r>
           </w:p>
         </w:tc>
@@ -278,7 +335,9 @@
         <w:pStyle w:val="ImageCaption"/>
       </w:pPr>
       <w:r>
-        <w:t xml:space="preserve">Image Caption</w:t>
+        <w:t xml:space="preserve">
+Image Caption
+</w:t>
       </w:r>
     </w:p>
     <w:p>
@@ -286,7 +345,9 @@
         <w:pStyle w:val="DefinitionTerm"/>
       </w:pPr>
       <w:r>
-        <w:t xml:space="preserve">DefinitionTerm</w:t>
+        <w:t xml:space="preserve">
+DefinitionTerm
+</w:t>
       </w:r>
     </w:p>
     <w:p>
@@ -294,7 +355,9 @@
         <w:pStyle w:val="Definition"/>
       </w:pPr>
       <w:r>
-        <w:t xml:space="preserve">Definition</w:t>
+        <w:t xml:space="preserve">
+Definition
+</w:t>
       </w:r>
     </w:p>
     <w:p>
@@ -302,7 +365,9 @@
         <w:pStyle w:val="DefinitionTerm"/>
       </w:pPr>
       <w:r>
-        <w:t xml:space="preserve">DefinitionTerm</w:t>
+        <w:t xml:space="preserve">
+DefinitionTerm
+</w:t>
       </w:r>
     </w:p>
     <w:p>
@@ -310,7 +375,9 @@
         <w:pStyle w:val="Definition"/>
       </w:pPr>
       <w:r>
-        <w:t xml:space="preserve">Definition</w:t>
+        <w:t xml:space="preserve">
+Definition
+</w:t>
       </w:r>
     </w:p>
     <w:sectPr>
@@ -320,7 +387,7 @@
         <w:numRestart w:val="eachSect"/>
       </w:footnotePr>
       <w:pgSz w:h="16838" w:w="11906"/>
-      <w:pgMar w:left="1247" w:right="1247" w:top="1417" w:bottom="1247"/>
+      <w:pgMar w:left="1247" w:right="1247" w:top="1417" w:bottom="1247" w:header="709" w:footer="709" w:gutter="0"/>
     </w:sectPr>
   </w:body>
 </w:document>
@@ -385,15 +452,10 @@
         <w:footnoteRef/>
       </w:r>
       <w:r>
-        <w:t>Footnote Text.</w:t>
-      </w:r>
-    </w:p>
-    <w:p>
-      <w:pPr>
-        <w:pStyle w:val="FootnoteBlockText"/>
-      </w:pPr>
-      <w:r>
-        <w:t>Footnote Block Text</w:t>
+        <w:t xml:space="preserve"> </w:t>
+      </w:r>
+      <w:r>
+        <w:t xml:space="preserve">Footnote Text.</w:t>
       </w:r>
     </w:p>
   </w:footnote>
@@ -550,8 +612,28 @@
       </w:pPr>
     </w:lvl>
   </w:abstractNum>
+  <w:abstractNum w:abstractNumId="991">
+    <w:multiLevelType w:val="singleLevel"/>
+    <w:lvl w:ilvl="0">
+      <w:start w:val="1"/>
+      <w:numFmt w:val="decimal"/>
+      <w:pStyle w:val="PPADEMKeyFindings"/>
+      <w:lvlText w:val="%1."/>
+      <w:lvlJc w:val="left"/>
+      <w:pPr>
+        <w:ind w:left="680" w:hanging="400"/>
+      </w:pPr>
+      <w:rPr>
+        <w:b/>
+        <w:color w:val="298C8C"/>
+      </w:rPr>
+    </w:lvl>
+  </w:abstractNum>
   <w:num w:numId="1000">
     <w:abstractNumId w:val="990"/>
+  </w:num>
+  <w:num w:numId="1001">
+    <w:abstractNumId w:val="991"/>
   </w:num>
 </w:numbering>
 </file>
@@ -561,10 +643,10 @@
   <w:docDefaults>
     <w:rPrDefault>
       <w:rPr>
-        <w:rFonts w:asciiTheme="minorHAnsi" w:eastAsiaTheme="minorEastAsia" w:hAnsiTheme="minorHAnsi" w:cstheme="minorBidi"/>
+        <w:rFonts w:asciiTheme="minorHAnsi" w:eastAsiaTheme="minorHAnsi" w:hAnsiTheme="minorHAnsi" w:cstheme="minorBidi"/>
         <w:sz w:val="24"/>
         <w:szCs w:val="24"/>
-        <w:lang w:val="en-US" w:eastAsia="zh-CN" w:bidi="ar-SA"/>
+        <w:lang w:val="en-US" w:eastAsia="en-US" w:bidi="ar-SA"/>
       </w:rPr>
     </w:rPrDefault>
     <w:pPrDefault>
@@ -753,11 +835,11 @@
     <w:pPr>
       <w:keepNext/>
       <w:keepLines/>
-      <w:spacing w:before="100" w:after="300"/>
-      <w:shd w:val="clear" w:color="auto" w:fill="fdf2f2"/>
       <w:pBdr>
         <w:left w:val="single" w:sz="24" w:space="8" w:color="990000"/>
       </w:pBdr>
+      <w:shd w:val="clear" w:color="auto" w:fill="FDF2F2"/>
+      <w:spacing w:before="100" w:after="300"/>
     </w:pPr>
     <w:rPr>
       <w:rFonts w:ascii="Arial" w:hAnsi="Arial" w:eastAsia="Arial" w:cs="Arial"/>
@@ -785,11 +867,11 @@
     <w:pPr>
       <w:keepNext/>
       <w:keepLines/>
+      <w:pBdr>
+        <w:bottom w:val="single" w:sz="8" w:space="4" w:color="F2D0D0"/>
+      </w:pBdr>
       <w:spacing w:before="360" w:after="160"/>
       <w:outlineLvl w:val="0"/>
-      <w:pBdr>
-        <w:bottom w:val="single" w:sz="8" w:space="4" w:color="f2d0d0"/>
-      </w:pBdr>
     </w:pPr>
     <w:rPr>
       <w:rFonts w:ascii="Arial" w:hAnsi="Arial" w:eastAsia="Arial" w:cs="Arial"/>
@@ -1114,12 +1196,12 @@
     <w:unhideWhenUsed/>
     <w:qFormat/>
     <w:pPr>
+      <w:pBdr>
+        <w:left w:val="single" w:sz="24" w:space="10" w:color="298C8C"/>
+      </w:pBdr>
+      <w:shd w:val="clear" w:color="auto" w:fill="E8F5F5"/>
       <w:spacing w:before="100" w:after="100"/>
       <w:ind w:firstLine="0" w:left="480" w:right="480"/>
-      <w:pBdr>
-        <w:left w:val="single" w:sz="24" w:space="10" w:color="298c8c"/>
-      </w:pBdr>
-      <w:shd w:val="clear" w:color="auto" w:fill="e8f5f5"/>
     </w:pPr>
     <w:rPr>
       <w:rFonts w:ascii="Arial" w:hAnsi="Arial" w:eastAsia="Arial" w:cs="Arial"/>
@@ -1161,17 +1243,17 @@
     <w:qFormat/>
     <w:tblPr>
       <w:tblInd w:w="0" w:type="dxa"/>
+      <w:tblBorders>
+        <w:top w:val="single" w:sz="4" w:color="E5E7EB"/>
+        <w:bottom w:val="single" w:sz="4" w:color="E5E7EB"/>
+        <w:insideH w:val="single" w:sz="4" w:color="E5E7EB"/>
+      </w:tblBorders>
       <w:tblCellMar>
         <w:top w:w="0" w:type="dxa"/>
         <w:left w:w="108" w:type="dxa"/>
         <w:bottom w:w="0" w:type="dxa"/>
         <w:right w:w="108" w:type="dxa"/>
       </w:tblCellMar>
-      <w:tblBorders>
-        <w:top w:val="single" w:sz="4" w:color="e5e7eb"/>
-        <w:bottom w:val="single" w:sz="4" w:color="e5e7eb"/>
-        <w:insideH w:val="single" w:sz="4" w:color="e5e7eb"/>
-      </w:tblBorders>
     </w:tblPr>
     <w:tblStylePr w:type="firstRow">
       <w:rPr>
@@ -1182,7 +1264,7 @@
         <w:tcBorders>
           <w:bottom w:val="single" w:sz="12" w:color="990000"/>
         </w:tcBorders>
-        <w:shd w:val="clear" w:color="auto" w:fill="fdf2f2"/>
+        <w:shd w:val="clear" w:color="auto" w:fill="FDF2F2"/>
       </w:tcPr>
     </w:tblStylePr>
   </w:style>
@@ -1301,154 +1383,224 @@
       <w:sz w:val="32"/>
     </w:rPr>
   </w:style>
+  <w:style w:type="paragraph" w:customStyle="1" w:styleId="PPADEMExecutiveSummary">
+    <w:name w:val="PPADEM Executive Summary"/>
+    <w:basedOn w:val="BodyText"/>
+    <w:qFormat/>
+    <w:pPr>
+      <w:pBdr>
+        <w:top w:val="single" w:sz="4" w:space="6" w:color="FDF2F2"/>
+        <w:left w:val="single" w:sz="24" w:space="8" w:color="990000"/>
+        <w:bottom w:val="single" w:sz="4" w:space="6" w:color="FDF2F2"/>
+      </w:pBdr>
+      <w:shd w:val="clear" w:color="auto" w:fill="FDF2F2"/>
+      <w:spacing w:before="200" w:after="200"/>
+      <w:ind w:left="170" w:right="170"/>
+      <w:contextualSpacing/>
+    </w:pPr>
+    <w:rPr>
+      <w:rFonts w:ascii="Arial" w:hAnsi="Arial" w:eastAsia="Arial" w:cs="Arial"/>
+      <w:b w:val="0"/>
+      <w:color w:val="24292E"/>
+      <w:sz w:val="21"/>
+    </w:rPr>
+  </w:style>
+  <w:style w:type="paragraph" w:customStyle="1" w:styleId="PPADEMKeyFindings">
+    <w:name w:val="PPADEM Key Findings"/>
+    <w:basedOn w:val="BodyText"/>
+    <w:qFormat/>
+    <w:pPr>
+      <w:numPr>
+        <w:numId w:val="1001"/>
+      </w:numPr>
+      <w:pBdr>
+        <w:top w:val="single" w:sz="4" w:space="6" w:color="E8F5F5"/>
+        <w:left w:val="single" w:sz="24" w:space="8" w:color="298C8C"/>
+        <w:bottom w:val="single" w:sz="4" w:space="6" w:color="E8F5F5"/>
+      </w:pBdr>
+      <w:shd w:val="clear" w:color="auto" w:fill="E8F5F5"/>
+      <w:spacing w:before="200" w:after="200"/>
+      <w:ind w:right="170"/>
+      <w:contextualSpacing/>
+    </w:pPr>
+    <w:rPr>
+      <w:rFonts w:ascii="Arial" w:hAnsi="Arial" w:eastAsia="Arial" w:cs="Arial"/>
+      <w:b w:val="0"/>
+      <w:color w:val="212529"/>
+      <w:sz w:val="21"/>
+    </w:rPr>
+  </w:style>
+  <w:style w:type="paragraph" w:customStyle="1" w:styleId="PPADEMNote">
+    <w:name w:val="PPADEM Note"/>
+    <w:basedOn w:val="BodyText"/>
+    <w:qFormat/>
+    <w:pPr>
+      <w:pBdr>
+        <w:top w:val="single" w:sz="4" w:space="6" w:color="E8F5F5"/>
+        <w:left w:val="single" w:sz="24" w:space="8" w:color="298C8C"/>
+        <w:bottom w:val="single" w:sz="4" w:space="6" w:color="E8F5F5"/>
+      </w:pBdr>
+      <w:shd w:val="clear" w:color="auto" w:fill="E8F5F5"/>
+      <w:spacing w:before="200" w:after="200"/>
+      <w:ind w:left="170" w:right="170"/>
+      <w:contextualSpacing/>
+    </w:pPr>
+    <w:rPr>
+      <w:rFonts w:ascii="Arial" w:hAnsi="Arial" w:eastAsia="Arial" w:cs="Arial"/>
+      <w:b w:val="0"/>
+      <w:color w:val="212529"/>
+      <w:sz w:val="21"/>
+    </w:rPr>
+  </w:style>
+  <w:style w:type="paragraph" w:customStyle="1" w:styleId="PPADEMWarning">
+    <w:name w:val="PPADEM Warning"/>
+    <w:basedOn w:val="BodyText"/>
+    <w:qFormat/>
+    <w:pPr>
+      <w:pBdr>
+        <w:top w:val="single" w:sz="4" w:space="6" w:color="FEF6E9"/>
+        <w:left w:val="single" w:sz="24" w:space="8" w:color="F1A226"/>
+        <w:bottom w:val="single" w:sz="4" w:space="6" w:color="FEF6E9"/>
+      </w:pBdr>
+      <w:shd w:val="clear" w:color="auto" w:fill="FEF6E9"/>
+      <w:spacing w:before="200" w:after="200"/>
+      <w:ind w:left="170" w:right="170"/>
+      <w:contextualSpacing/>
+    </w:pPr>
+    <w:rPr>
+      <w:rFonts w:ascii="Arial" w:hAnsi="Arial" w:eastAsia="Arial" w:cs="Arial"/>
+      <w:b w:val="0"/>
+      <w:color w:val="212529"/>
+      <w:sz w:val="21"/>
+    </w:rPr>
+  </w:style>
+  <w:style w:type="paragraph" w:customStyle="1" w:styleId="PPADEMImportant">
+    <w:name w:val="PPADEM Important"/>
+    <w:basedOn w:val="BodyText"/>
+    <w:qFormat/>
+    <w:pPr>
+      <w:pBdr>
+        <w:top w:val="single" w:sz="4" w:space="6" w:color="FDF2F2"/>
+        <w:left w:val="single" w:sz="24" w:space="8" w:color="990000"/>
+        <w:bottom w:val="single" w:sz="4" w:space="6" w:color="FDF2F2"/>
+      </w:pBdr>
+      <w:shd w:val="clear" w:color="auto" w:fill="FDF2F2"/>
+      <w:spacing w:before="200" w:after="200"/>
+      <w:ind w:left="170" w:right="170"/>
+      <w:contextualSpacing/>
+    </w:pPr>
+    <w:rPr>
+      <w:rFonts w:ascii="Arial" w:hAnsi="Arial" w:eastAsia="Arial" w:cs="Arial"/>
+      <w:b w:val="0"/>
+      <w:color w:val="212529"/>
+      <w:sz w:val="21"/>
+    </w:rPr>
+  </w:style>
+  <w:style w:type="paragraph" w:customStyle="1" w:styleId="PPADEMPullQuote">
+    <w:name w:val="PPADEM Pull Quote"/>
+    <w:basedOn w:val="BodyText"/>
+    <w:next w:val="PPADEMQuoteAttribution"/>
+    <w:qFormat/>
+    <w:pPr>
+      <w:keepNext/>
+      <w:pBdr>
+        <w:left w:val="single" w:sz="32" w:space="12" w:color="990000"/>
+      </w:pBdr>
+      <w:spacing w:before="240" w:after="40"/>
+      <w:ind w:left="340"/>
+    </w:pPr>
+    <w:rPr>
+      <w:rFonts w:ascii="Arial" w:hAnsi="Arial" w:eastAsia="Arial" w:cs="Arial"/>
+      <w:i/>
+      <w:color w:val="24292E"/>
+      <w:sz w:val="28"/>
+    </w:rPr>
+  </w:style>
+  <w:style w:type="paragraph" w:customStyle="1" w:styleId="PPADEMQuoteAttribution">
+    <w:name w:val="PPADEM Quote Attribution"/>
+    <w:basedOn w:val="BodyText"/>
+    <w:next w:val="BodyText"/>
+    <w:pPr>
+      <w:spacing w:after="240"/>
+      <w:ind w:left="340"/>
+    </w:pPr>
+    <w:rPr>
+      <w:rFonts w:ascii="Arial" w:hAnsi="Arial" w:eastAsia="Arial" w:cs="Arial"/>
+      <w:b/>
+      <w:color w:val="555E68"/>
+      <w:sz w:val="19"/>
+    </w:rPr>
+  </w:style>
+  <w:style w:type="paragraph" w:customStyle="1" w:styleId="PPADEMLabel">
+    <w:name w:val="PPADEM Label"/>
+    <w:basedOn w:val="BodyText"/>
+    <w:qFormat/>
+    <w:pPr>
+      <w:keepNext/>
+      <w:spacing w:before="200" w:after="60"/>
+    </w:pPr>
+    <w:rPr>
+      <w:rFonts w:ascii="Arial" w:hAnsi="Arial" w:eastAsia="Arial" w:cs="Arial"/>
+      <w:b/>
+      <w:caps/>
+      <w:color w:val="990000"/>
+      <w:sz w:val="17"/>
+    </w:rPr>
+  </w:style>
 </w:styles>
 </file>
 
 <file path=word/theme/theme1.xml><?xml version="1.0" encoding="utf-8"?>
-<a:theme xmlns:a="http://schemas.openxmlformats.org/drawingml/2006/main" name="Office Theme">
+<a:theme xmlns:a="http://schemas.openxmlformats.org/drawingml/2006/main" name="PPADEM">
   <a:themeElements>
-    <a:clrScheme name="Office">
+    <a:clrScheme name="PPADEM">
       <a:dk1>
-        <a:sysClr val="windowText" lastClr="000000"/>
+        <a:srgbClr val="212529"/>
       </a:dk1>
       <a:lt1>
-        <a:sysClr val="window" lastClr="FFFFFF"/>
+        <a:srgbClr val="FFFFFF"/>
       </a:lt1>
       <a:dk2>
-        <a:srgbClr val="0E2841"/>
+        <a:srgbClr val="660000"/>
       </a:dk2>
       <a:lt2>
-        <a:srgbClr val="E8E8E8"/>
+        <a:srgbClr val="F8F9FA"/>
       </a:lt2>
       <a:accent1>
-        <a:srgbClr val="156082"/>
+        <a:srgbClr val="990000"/>
       </a:accent1>
       <a:accent2>
-        <a:srgbClr val="E97132"/>
+        <a:srgbClr val="298C8C"/>
       </a:accent2>
       <a:accent3>
-        <a:srgbClr val="196B24"/>
+        <a:srgbClr val="F1A226"/>
       </a:accent3>
       <a:accent4>
-        <a:srgbClr val="0F9ED5"/>
+        <a:srgbClr val="B8B8B8"/>
       </a:accent4>
       <a:accent5>
-        <a:srgbClr val="A02B93"/>
+        <a:srgbClr val="24292E"/>
       </a:accent5>
       <a:accent6>
-        <a:srgbClr val="4EA72E"/>
+        <a:srgbClr val="1F6B6B"/>
       </a:accent6>
       <a:hlink>
-        <a:srgbClr val="467886"/>
+        <a:srgbClr val="990000"/>
       </a:hlink>
       <a:folHlink>
-        <a:srgbClr val="96607D"/>
+        <a:srgbClr val="1F6B6B"/>
       </a:folHlink>
     </a:clrScheme>
-    <a:fontScheme name="Office">
+    <a:fontScheme name="PPADEM">
       <a:majorFont>
-        <a:latin typeface="Aptos Display" panose="02110004020202020204"/>
+        <a:latin typeface="Arial"/>
         <a:ea typeface=""/>
         <a:cs typeface=""/>
-        <a:font script="Jpan" typeface="游ゴシック Light"/>
-        <a:font script="Hang" typeface="맑은 고딕"/>
-        <a:font script="Hans" typeface="等线 Light"/>
-        <a:font script="Hant" typeface="新細明體"/>
-        <a:font script="Arab" typeface="Times New Roman"/>
-        <a:font script="Hebr" typeface="Times New Roman"/>
-        <a:font script="Thai" typeface="Angsana New"/>
-        <a:font script="Ethi" typeface="Nyala"/>
-        <a:font script="Beng" typeface="Vrinda"/>
-        <a:font script="Gujr" typeface="Shruti"/>
-        <a:font script="Khmr" typeface="MoolBoran"/>
-        <a:font script="Knda" typeface="Tunga"/>
-        <a:font script="Guru" typeface="Raavi"/>
-        <a:font script="Cans" typeface="Euphemia"/>
-        <a:font script="Cher" typeface="Plantagenet Cherokee"/>
-        <a:font script="Yiii" typeface="Microsoft Yi Baiti"/>
-        <a:font script="Tibt" typeface="Microsoft Himalaya"/>
-        <a:font script="Thaa" typeface="MV Boli"/>
-        <a:font script="Deva" typeface="Mangal"/>
-        <a:font script="Telu" typeface="Gautami"/>
-        <a:font script="Taml" typeface="Latha"/>
-        <a:font script="Syrc" typeface="Estrangelo Edessa"/>
-        <a:font script="Orya" typeface="Kalinga"/>
-        <a:font script="Mlym" typeface="Kartika"/>
-        <a:font script="Laoo" typeface="DokChampa"/>
-        <a:font script="Sinh" typeface="Iskoola Pota"/>
-        <a:font script="Mong" typeface="Mongolian Baiti"/>
-        <a:font script="Viet" typeface="Times New Roman"/>
-        <a:font script="Uigh" typeface="Microsoft Uighur"/>
-        <a:font script="Geor" typeface="Sylfaen"/>
-        <a:font script="Armn" typeface="Arial"/>
-        <a:font script="Bugi" typeface="Leelawadee UI"/>
-        <a:font script="Bopo" typeface="Microsoft JhengHei"/>
-        <a:font script="Java" typeface="Javanese Text"/>
-        <a:font script="Lisu" typeface="Segoe UI"/>
-        <a:font script="Mymr" typeface="Myanmar Text"/>
-        <a:font script="Nkoo" typeface="Ebrima"/>
-        <a:font script="Olck" typeface="Nirmala UI"/>
-        <a:font script="Osma" typeface="Ebrima"/>
-        <a:font script="Phag" typeface="Phagspa"/>
-        <a:font script="Syrn" typeface="Estrangelo Edessa"/>
-        <a:font script="Syrj" typeface="Estrangelo Edessa"/>
-        <a:font script="Syre" typeface="Estrangelo Edessa"/>
-        <a:font script="Sora" typeface="Nirmala UI"/>
-        <a:font script="Tale" typeface="Microsoft Tai Le"/>
-        <a:font script="Talu" typeface="Microsoft New Tai Lue"/>
-        <a:font script="Tfng" typeface="Ebrima"/>
       </a:majorFont>
       <a:minorFont>
-        <a:latin typeface="Aptos" panose="02110004020202020204"/>
+        <a:latin typeface="Arial"/>
         <a:ea typeface=""/>
         <a:cs typeface=""/>
-        <a:font script="Jpan" typeface="游明朝"/>
-        <a:font script="Hang" typeface="맑은 고딕"/>
-        <a:font script="Hans" typeface="等线"/>
-        <a:font script="Hant" typeface="新細明體"/>
-        <a:font script="Arab" typeface="Arial"/>
-        <a:font script="Hebr" typeface="Arial"/>
-        <a:font script="Thai" typeface="Cordia New"/>
-        <a:font script="Ethi" typeface="Nyala"/>
-        <a:font script="Beng" typeface="Vrinda"/>
-        <a:font script="Gujr" typeface="Shruti"/>
-        <a:font script="Khmr" typeface="DaunPenh"/>
-        <a:font script="Knda" typeface="Tunga"/>
-        <a:font script="Guru" typeface="Raavi"/>
-        <a:font script="Cans" typeface="Euphemia"/>
-        <a:font script="Cher" typeface="Plantagenet Cherokee"/>
-        <a:font script="Yiii" typeface="Microsoft Yi Baiti"/>
-        <a:font script="Tibt" typeface="Microsoft Himalaya"/>
-        <a:font script="Thaa" typeface="MV Boli"/>
-        <a:font script="Deva" typeface="Mangal"/>
-        <a:font script="Telu" typeface="Gautami"/>
-        <a:font script="Taml" typeface="Latha"/>
-        <a:font script="Syrc" typeface="Estrangelo Edessa"/>
-        <a:font script="Orya" typeface="Kalinga"/>
-        <a:font script="Mlym" typeface="Kartika"/>
-        <a:font script="Laoo" typeface="DokChampa"/>
-        <a:font script="Sinh" typeface="Iskoola Pota"/>
-        <a:font script="Mong" typeface="Mongolian Baiti"/>
-        <a:font script="Viet" typeface="Arial"/>
-        <a:font script="Uigh" typeface="Microsoft Uighur"/>
-        <a:font script="Geor" typeface="Sylfaen"/>
-        <a:font script="Armn" typeface="Arial"/>
-        <a:font script="Bugi" typeface="Leelawadee UI"/>
-        <a:font script="Bopo" typeface="Microsoft JhengHei"/>
-        <a:font script="Java" typeface="Javanese Text"/>
-        <a:font script="Lisu" typeface="Segoe UI"/>
-        <a:font script="Mymr" typeface="Myanmar Text"/>
-        <a:font script="Nkoo" typeface="Ebrima"/>
-        <a:font script="Olck" typeface="Nirmala UI"/>
-        <a:font script="Osma" typeface="Ebrima"/>
-        <a:font script="Phag" typeface="Phagspa"/>
-        <a:font script="Syrn" typeface="Estrangelo Edessa"/>
-        <a:font script="Syrj" typeface="Estrangelo Edessa"/>
-        <a:font script="Syre" typeface="Estrangelo Edessa"/>
-        <a:font script="Sora" typeface="Nirmala UI"/>
-        <a:font script="Tale" typeface="Microsoft Tai Le"/>
-        <a:font script="Talu" typeface="Microsoft New Tai Lue"/>
-        <a:font script="Tfng" typeface="Ebrima"/>
       </a:minorFont>
     </a:fontScheme>
     <a:fmtScheme name="Office">

</xml_diff>

<commit_message>
Add EU funding logo across all formats
Introduce a shared `ppadem-funding.lua` flow and `eu-logo.png` asset so every output ends with the EU/ERC funding logo, including a dedicated final slide for PowerPoint and end-of-document placement for HTML, Word, slides, and brief outputs. Wire the filter and resources into all relevant extensions, add shared styling, and update the brief Typst template.

Update brand sync tooling to distribute the new logo and Lua filter, extend Office template builders/reference files to include the funding logo, add cleanup support in `justfile`, and refresh README/office template docs plus license wording to document the new behavior.
</commit_message>
<xml_diff>
--- a/_extensions/ppadem-word/ppadem-reference.docx
+++ b/_extensions/ppadem-word/ppadem-reference.docx
@@ -7,7 +7,9 @@
         <w:pStyle w:val="Title"/>
       </w:pPr>
       <w:r>
-        <w:t xml:space="preserve">Title</w:t>
+        <w:t xml:space="preserve">
+Title
+</w:t>
       </w:r>
     </w:p>
     <w:p>
@@ -15,7 +17,9 @@
         <w:pStyle w:val="Subtitle"/>
       </w:pPr>
       <w:r>
-        <w:t xml:space="preserve">Subtitle</w:t>
+        <w:t xml:space="preserve">
+Subtitle
+</w:t>
       </w:r>
     </w:p>
     <w:p>
@@ -23,7 +27,9 @@
         <w:pStyle w:val="Author"/>
       </w:pPr>
       <w:r>
-        <w:t xml:space="preserve">Author</w:t>
+        <w:t xml:space="preserve">
+Author
+</w:t>
       </w:r>
     </w:p>
     <w:p>
@@ -31,7 +37,9 @@
         <w:pStyle w:val="Date"/>
       </w:pPr>
       <w:r>
-        <w:t xml:space="preserve">Date</w:t>
+        <w:t xml:space="preserve">
+Date
+</w:t>
       </w:r>
     </w:p>
     <w:p>
@@ -39,7 +47,9 @@
         <w:pStyle w:val="Abstract"/>
       </w:pPr>
       <w:r>
-        <w:t xml:space="preserve">Abstract</w:t>
+        <w:t xml:space="preserve">
+Abstract
+</w:t>
       </w:r>
     </w:p>
     <w:p>
@@ -48,7 +58,9 @@
       </w:pPr>
       <w:bookmarkStart w:id="21" w:name="heading-1"/>
       <w:r>
-        <w:t xml:space="preserve">Heading 1</w:t>
+        <w:t xml:space="preserve">
+Heading 1
+</w:t>
       </w:r>
       <w:bookmarkEnd w:id="21"/>
     </w:p>
@@ -58,7 +70,9 @@
       </w:pPr>
       <w:bookmarkStart w:id="22" w:name="heading-2"/>
       <w:r>
-        <w:t xml:space="preserve">Heading 2</w:t>
+        <w:t xml:space="preserve">
+Heading 2
+</w:t>
       </w:r>
       <w:bookmarkEnd w:id="22"/>
     </w:p>
@@ -68,7 +82,9 @@
       </w:pPr>
       <w:bookmarkStart w:id="23" w:name="heading-3"/>
       <w:r>
-        <w:t xml:space="preserve">Heading 3</w:t>
+        <w:t xml:space="preserve">
+Heading 3
+</w:t>
       </w:r>
       <w:bookmarkEnd w:id="23"/>
     </w:p>
@@ -78,7 +94,9 @@
       </w:pPr>
       <w:bookmarkStart w:id="24" w:name="heading-4"/>
       <w:r>
-        <w:t xml:space="preserve">Heading 4</w:t>
+        <w:t xml:space="preserve">
+Heading 4
+</w:t>
       </w:r>
       <w:bookmarkEnd w:id="24"/>
     </w:p>
@@ -88,7 +106,9 @@
       </w:pPr>
       <w:bookmarkStart w:id="25" w:name="heading-5"/>
       <w:r>
-        <w:t xml:space="preserve">Heading 5</w:t>
+        <w:t xml:space="preserve">
+Heading 5
+</w:t>
       </w:r>
       <w:bookmarkEnd w:id="25"/>
     </w:p>
@@ -98,7 +118,9 @@
       </w:pPr>
       <w:bookmarkStart w:id="26" w:name="heading-6"/>
       <w:r>
-        <w:t xml:space="preserve">Heading 6</w:t>
+        <w:t xml:space="preserve">
+Heading 6
+</w:t>
       </w:r>
       <w:bookmarkEnd w:id="26"/>
     </w:p>
@@ -108,7 +130,9 @@
       </w:pPr>
       <w:bookmarkStart w:id="27" w:name="heading-7"/>
       <w:r>
-        <w:t xml:space="preserve">Heading 7</w:t>
+        <w:t xml:space="preserve">
+Heading 7
+</w:t>
       </w:r>
       <w:bookmarkEnd w:id="27"/>
     </w:p>
@@ -118,7 +142,9 @@
       </w:pPr>
       <w:bookmarkStart w:id="28" w:name="heading-8"/>
       <w:r>
-        <w:t xml:space="preserve">Heading 8</w:t>
+        <w:t xml:space="preserve">
+Heading 8
+</w:t>
       </w:r>
       <w:bookmarkEnd w:id="28"/>
     </w:p>
@@ -128,7 +154,9 @@
       </w:pPr>
       <w:bookmarkStart w:id="29" w:name="heading-9"/>
       <w:r>
-        <w:t xml:space="preserve">Heading 9</w:t>
+        <w:t xml:space="preserve">
+Heading 9
+</w:t>
       </w:r>
       <w:bookmarkEnd w:id="29"/>
     </w:p>
@@ -137,7 +165,9 @@
         <w:pStyle w:val="FirstParagraph"/>
       </w:pPr>
       <w:r>
-        <w:t xml:space="preserve">First Paragraph.</w:t>
+        <w:t xml:space="preserve">
+First Paragraph.
+</w:t>
       </w:r>
     </w:p>
     <w:p>
@@ -145,39 +175,54 @@
         <w:pStyle w:val="BodyText"/>
       </w:pPr>
       <w:r>
-        <w:t xml:space="preserve">Body Text. Body Text Char.</w:t>
-      </w:r>
-      <w:r>
-        <w:t xml:space="preserve"> </w:t>
+        <w:t xml:space="preserve">
+Body Text. Body Text Char.
+</w:t>
+      </w:r>
+      <w:r>
+        <w:t xml:space="preserve">
+</w:t>
       </w:r>
       <w:r>
         <w:rPr>
           <w:rStyle w:val="VerbatimChar"/>
         </w:rPr>
-        <w:t xml:space="preserve">Verbatim Char</w:t>
-      </w:r>
-      <w:r>
-        <w:t xml:space="preserve">.</w:t>
-      </w:r>
-      <w:r>
-        <w:t xml:space="preserve"> </w:t>
+        <w:t xml:space="preserve">
+Verbatim Char
+</w:t>
+      </w:r>
+      <w:r>
+        <w:t xml:space="preserve">
+.
+</w:t>
+      </w:r>
+      <w:r>
+        <w:t xml:space="preserve">
+</w:t>
       </w:r>
       <w:hyperlink r:id="rId30">
         <w:r>
           <w:rPr>
             <w:rStyle w:val="Hyperlink"/>
           </w:rPr>
-          <w:t xml:space="preserve">Hyperlink</w:t>
+          <w:t xml:space="preserve">
+Hyperlink
+</w:t>
         </w:r>
       </w:hyperlink>
       <w:r>
-        <w:t xml:space="preserve">.</w:t>
-      </w:r>
-      <w:r>
-        <w:t xml:space="preserve"> </w:t>
-      </w:r>
-      <w:r>
-        <w:t xml:space="preserve">Footnote.</w:t>
+        <w:t xml:space="preserve">
+.
+</w:t>
+      </w:r>
+      <w:r>
+        <w:t xml:space="preserve">
+</w:t>
+      </w:r>
+      <w:r>
+        <w:t xml:space="preserve">
+Footnote.
+</w:t>
       </w:r>
       <w:r>
         <w:rPr>
@@ -191,7 +236,9 @@
         <w:pStyle w:val="BlockText"/>
       </w:pPr>
       <w:r>
-        <w:t xml:space="preserve">Block Text.</w:t>
+        <w:t xml:space="preserve">
+Block Text.
+</w:t>
       </w:r>
     </w:p>
     <w:p>
@@ -199,7 +246,9 @@
         <w:pStyle w:val="TableCaption"/>
       </w:pPr>
       <w:r>
-        <w:t xml:space="preserve">Table caption.</w:t>
+        <w:t xml:space="preserve">
+Table caption.
+</w:t>
       </w:r>
     </w:p>
     <w:tbl>
@@ -226,7 +275,9 @@
               <w:jc w:val="left"/>
             </w:pPr>
             <w:r>
-              <w:t xml:space="preserve">Table</w:t>
+              <w:t xml:space="preserve">
+Table
+</w:t>
             </w:r>
           </w:p>
         </w:tc>
@@ -243,7 +294,9 @@
               <w:jc w:val="left"/>
             </w:pPr>
             <w:r>
-              <w:t xml:space="preserve">Table</w:t>
+              <w:t xml:space="preserve">
+Table
+</w:t>
             </w:r>
           </w:p>
         </w:tc>
@@ -256,7 +309,9 @@
               <w:jc w:val="left"/>
             </w:pPr>
             <w:r>
-              <w:t xml:space="preserve">1</w:t>
+              <w:t xml:space="preserve">
+1
+</w:t>
             </w:r>
           </w:p>
         </w:tc>
@@ -267,7 +322,9 @@
               <w:jc w:val="left"/>
             </w:pPr>
             <w:r>
-              <w:t xml:space="preserve">2</w:t>
+              <w:t xml:space="preserve">
+2
+</w:t>
             </w:r>
           </w:p>
         </w:tc>
@@ -278,7 +335,9 @@
         <w:pStyle w:val="ImageCaption"/>
       </w:pPr>
       <w:r>
-        <w:t xml:space="preserve">Image Caption</w:t>
+        <w:t xml:space="preserve">
+Image Caption
+</w:t>
       </w:r>
     </w:p>
     <w:p>
@@ -286,7 +345,9 @@
         <w:pStyle w:val="DefinitionTerm"/>
       </w:pPr>
       <w:r>
-        <w:t xml:space="preserve">DefinitionTerm</w:t>
+        <w:t xml:space="preserve">
+DefinitionTerm
+</w:t>
       </w:r>
     </w:p>
     <w:p>
@@ -294,7 +355,9 @@
         <w:pStyle w:val="Definition"/>
       </w:pPr>
       <w:r>
-        <w:t xml:space="preserve">Definition</w:t>
+        <w:t xml:space="preserve">
+Definition
+</w:t>
       </w:r>
     </w:p>
     <w:p>
@@ -302,7 +365,9 @@
         <w:pStyle w:val="DefinitionTerm"/>
       </w:pPr>
       <w:r>
-        <w:t xml:space="preserve">DefinitionTerm</w:t>
+        <w:t xml:space="preserve">
+DefinitionTerm
+</w:t>
       </w:r>
     </w:p>
     <w:p>
@@ -310,7 +375,9 @@
         <w:pStyle w:val="Definition"/>
       </w:pPr>
       <w:r>
-        <w:t xml:space="preserve">Definition</w:t>
+        <w:t xml:space="preserve">
+Definition
+</w:t>
       </w:r>
     </w:p>
     <w:sectPr>
@@ -385,15 +452,10 @@
         <w:footnoteRef/>
       </w:r>
       <w:r>
-        <w:t>Footnote Text.</w:t>
-      </w:r>
-    </w:p>
-    <w:p>
-      <w:pPr>
-        <w:pStyle w:val="FootnoteBlockText"/>
-      </w:pPr>
-      <w:r>
-        <w:t>Footnote Block Text</w:t>
+        <w:t xml:space="preserve"> </w:t>
+      </w:r>
+      <w:r>
+        <w:t xml:space="preserve">Footnote Text.</w:t>
       </w:r>
     </w:p>
   </w:footnote>
@@ -581,10 +643,10 @@
   <w:docDefaults>
     <w:rPrDefault>
       <w:rPr>
-        <w:rFonts w:asciiTheme="minorHAnsi" w:eastAsiaTheme="minorEastAsia" w:hAnsiTheme="minorHAnsi" w:cstheme="minorBidi"/>
+        <w:rFonts w:asciiTheme="minorHAnsi" w:eastAsiaTheme="minorHAnsi" w:hAnsiTheme="minorHAnsi" w:cstheme="minorBidi"/>
         <w:sz w:val="24"/>
         <w:szCs w:val="24"/>
-        <w:lang w:val="en-US" w:eastAsia="zh-CN" w:bidi="ar-SA"/>
+        <w:lang w:val="en-US" w:eastAsia="en-US" w:bidi="ar-SA"/>
       </w:rPr>
     </w:rPrDefault>
     <w:pPrDefault>

</xml_diff>